<commit_message>
feat: expand Trinity initiation perspective
</commit_message>
<xml_diff>
--- a/manuscript/chapter-02-the-checklist.docx
+++ b/manuscript/chapter-02-the-checklist.docx
@@ -57,7 +57,7 @@
     </w:p>
     <w:p>
       <w:r>
-        <w:t>Above Miner Town, surveillance drones moved their patient circuits through the clouds. Their thermal sensors tracked the heat leaving his skin; infrared lenses mapped circulation beneath it; motion analysis recorded every imbalance, tremor, and shift in posture. The chip told Trinity what his body was doing from within. The drones confirmed what it looked like from without. From this high above the mines, Elara could watch Gage breathe, warm, strain, and recover without ever having to meet his eyes.</w:t>
+        <w:t>Above Miner Town, surveillance drones moved their patient circuits through the clouds. Their thermal sensors tracked the heat leaving his skin; infrared lenses mapped circulation beneath it; motion analysis recorded every imbalance, tremor, and shift in posture. The chip told Trinity what his body was doing from within. The drones tracked how those changes appeared across his skin, movement, and heat signature. From this high above the mines, Elara could watch Gage breathe, warm, strain, and recover without ever having to meet his eyes.</w:t>
       </w:r>
     </w:p>
     <w:p>
@@ -87,12 +87,27 @@
     </w:p>
     <w:p>
       <w:r>
-        <w:t>She moved through each item carefully, comparing the system's summary against the raw readings beneath it. Height. Weight. Resting pulse. Bone density. Work-shift history. There were numbers for everything Trinity thought could become a risk. Her job was to find the number that did not belong before it became a problem someone else had to contain.</w:t>
+        <w:t>She moved through each item carefully, comparing the system's summary against the raw readings beneath it. Height. Weight. Resting pulse. Respiration rate. Cortisol level. There were numbers for everything Trinity thought could become a risk. Her job was to find the number that did not belong before it became a problem someone else had to contain.</w:t>
       </w:r>
     </w:p>
     <w:p>
       <w:r>
         <w:t>Across from her, Rowan reviewed Ben's file with the quieter concentration of someone reading a report that might reveal an argument before it began. He checked family connections, work-group affiliations, disciplinary notes, and the small patterns of behavior that could turn a routine Initiation into an event worth recording. He did not look at Ben's photograph for long. The record was more useful than the face.</w:t>
+      </w:r>
+    </w:p>
+    <w:p>
+      <w:r>
+        <w:t>One entry had been elevated from the household archive: an unauthorized-aid incident involving Leroy, a repeat offender who had previously targeted Ben's family. The record showed that Gretchen persuaded the household to shelter him and spend their own rations on his recovery. Trinity classified the decision as a compassion anomaly and flagged Ben as an active participant.</w:t>
+      </w:r>
+    </w:p>
+    <w:p>
+      <w:r>
+        <w:t>The flag had remained after Leroy's later termination for obstructing a guard during an incident involving Gretchen. In the eleven months between those entries, he had become a trusted source of practical knowledge inside the household. The archive called it an informal influence network. Rowan saw the risk more clearly: the family had learned that people could change, that care could become loyalty, and that Trinity punished disruption more reliably than cruelty.</w:t>
+      </w:r>
+    </w:p>
+    <w:p>
+      <w:r>
+        <w:t>Ben's physical readings were ordinary. His history was not. The archive marked the household's conduct as a potential behavioral risk and an indicator of unauthorized moral reasoning. Rowan wondered whether that was why the assignment algorithm had failed to place him.</w:t>
       </w:r>
     </w:p>
     <w:p>
@@ -197,17 +212,7 @@
     </w:p>
     <w:p>
       <w:r>
-        <w:t>On the feed, Gage tore open his pouch. Steam clouded the drone lens for a moment. He smiled when he saw the meal inside, and the expression caught Elara off guard because none of the measurements beside it changed. His heart rate stayed elevated. His blood pressure remained high. The system had no field for relief.</w:t>
-      </w:r>
-    </w:p>
-    <w:p>
-      <w:r>
-        <w:t>Then he passed part of his food to Otto.</w:t>
-      </w:r>
-    </w:p>
-    <w:p>
-      <w:r>
-        <w:t>An amber line appeared across Elara's screen.</w:t>
+        <w:t>Within minutes, Elara's feed stacked alerts beside Gage's profile. He had redistributed his ration. Ben and Otto had remained within his proximity band. Then Gage's hydration intake fell sharply while his stimulant markers began to rise ahead of the predicted exposure curve.</w:t>
       </w:r>
     </w:p>
     <w:p>
@@ -217,32 +222,7 @@
     </w:p>
     <w:p>
       <w:r>
-        <w:t>She glanced at Rowan. His EVENT display had registered the same exchange between Ben and the others.</w:t>
-      </w:r>
-    </w:p>
-    <w:p>
-      <w:r>
-        <w:t>"They are sharing," he said.</w:t>
-      </w:r>
-    </w:p>
-    <w:p>
-      <w:r>
-        <w:t>"They are reducing individual intake," Daren replied without looking up.</w:t>
-      </w:r>
-    </w:p>
-    <w:p>
-      <w:r>
-        <w:t>Elara watched Gage accept a cup of water. The chip recorded the first swallow, then the second. On the third, he stopped. The overhead feed showed him staring into the cup, not drinking. His thermal map brightened at the face and throat. His pulse climbed another twelve beats per minute.</w:t>
-      </w:r>
-    </w:p>
-    <w:p>
-      <w:r>
         <w:t>CHEMICAL AVERSION RESPONSE: UNCONFIRMED.</w:t>
-      </w:r>
-    </w:p>
-    <w:p>
-      <w:r>
-        <w:t>Gage tipped the cup just enough for a thin stream to run into the dust. Then he bent close to Ben and Otto. The drones could not hear them over the chamber's ventilation, but their motion analysis marked the three bodies drawing together.</w:t>
       </w:r>
     </w:p>
     <w:p>
@@ -252,27 +232,22 @@
     </w:p>
     <w:p>
       <w:r>
-        <w:t>Elara opened the alert. The system offered her three choices: record the deviation, notify the floor wardens, or initiate corrective observation.</w:t>
+        <w:t>Rowan brought the three event logs onto the central grid. "He is responding to a pattern," he said. "Not merely refusing intake."</w:t>
       </w:r>
     </w:p>
     <w:p>
       <w:r>
-        <w:t>Below, Gage held something small between his fingers. It caught the drone's infrared light, then vanished inside the shelter of his sleeve. A few seconds later, he looked at the water again. His face changed.</w:t>
+        <w:t>Daren's gaze stayed on the loss projections. "The distinction changes nothing. He is creating instability in the cohort."</w:t>
       </w:r>
     </w:p>
     <w:p>
       <w:r>
-        <w:t>The birth-chip feed showed the same discovery in numbers. His blood glucose was normal. His hydration was falling. The stimulant markers in his bloodstream were beginning to rise. But Gage had stopped drinking before the predicted exposure window.</w:t>
+        <w:t>Elara enlarged the infrared clip that had triggered the final alert. For less than two seconds, something narrow and translucent appeared between Gage's fingers before he concealed it again. The drone could not identify the object. The system had no category for why three candidates who had entered separately were now shielding one another from the cameras.</w:t>
       </w:r>
     </w:p>
     <w:p>
       <w:r>
-        <w:t>He had seen something the system had not expected him to see.</w:t>
-      </w:r>
-    </w:p>
-    <w:p>
-      <w:r>
-        <w:t>Elara's finger rested over the warden-notification field.</w:t>
+        <w:t>Her console offered three actions: record the deviation, notify the floor wardens, or initiate corrective observation. Each would turn an incomplete interpretation into an official fact.</w:t>
       </w:r>
     </w:p>
     <w:p>
@@ -287,7 +262,7 @@
     </w:p>
     <w:p>
       <w:r>
-        <w:t>The alert remained open between them, waiting for her to turn three children trying to stay awake into a problem Trinity could solve.</w:t>
+        <w:t>The alert remained open between them. Elara was not protecting the children. She was protecting the possibility that the system had missed something.</w:t>
       </w:r>
     </w:p>
     <w:sectPr>

</xml_diff>

<commit_message>
Revise chapter 2: fix checklist items, archive framing, water/food timeline
</commit_message>
<xml_diff>
--- a/manuscript/chapter-02-the-checklist.docx
+++ b/manuscript/chapter-02-the-checklist.docx
@@ -37,12 +37,12 @@
     </w:p>
     <w:p>
       <w:r>
-        <w:t>Each terminal opened the same pre-Initiation checklist, though each version was shaped by its gana's priorities. Across the central grid, sixteen names waited in ordered columns. Thirteen had been placed without interruption. Three carried a small amber mark beside their names: MANUAL ASSIGNMENT. The designation was less alarming than UNASSIGNED, but it was not invisible.</w:t>
+        <w:t>Each terminal opened the same pre-Initiation checklist, though each version was shaped by its gana's priorities. Across the central grid, sixteen names waited in ordered columns. Thirteen had been placed without interruption. Three carried a small amber mark beside their names: MANUAL ASSIGNMENT. It was a quieter flag than UNASSIGNED, but it still marked them on the grid.</w:t>
       </w:r>
     </w:p>
     <w:p>
       <w:r>
-        <w:t>The manual overrides made Gage, Ben, and Otto anomalous candidates. Elara, Rowan, and Rohan were expected to keep them under continuous observation until the Initiation was complete. Trinity did not call it watching. The official language was enhanced oversight, as though attention could make a child safer rather than easier to control.</w:t>
+        <w:t>The manual overrides made Gage, Ben, and Otto anomalous candidates. Elara, Rowan, and Rohan were expected to keep them under continuous observation until the Initiation was complete. Trinity did not call it watching. The official language was enhanced oversight, dressed up as concern for the children's safety, when its only real function was to tighten the grip on them.</w:t>
       </w:r>
     </w:p>
     <w:p>
@@ -57,17 +57,16 @@
     </w:p>
     <w:p>
       <w:r>
-        <w:t>Above Miner Town, surveillance drones moved their patient circuits through the clouds. Their thermal sensors tracked the heat leaving his skin; infrared lenses mapped circulation beneath it; motion analysis recorded every imbalance, tremor, and shift in posture. The chip told Trinity what his body was doing from within. The drones tracked how those changes appeared across his skin, movement, and heat signature. From this high above the mines, Elara could watch Gage breathe, warm, strain, and recover without ever having to meet his eyes.</w:t>
+        <w:t>Above Miner Town, surveillance drones moved their patient circuits through the clouds. Their thermal sensors tracked the heat leaving his skin; infrared lenses mapped circulation beneath it; motion analysis recorded every imbalance, tremor, and shift in posture. The chip told Trinity what his body was doing from within. The drones tracked how those changes appeared across his skin, movement, and heat signature. From this high above the mines, Elara could watch Gage breathe, warm, strain, and recover without</w:t>
+      </w:r>
+      <w:r>
+        <w:t xml:space="preserve"> ever having to meet his eyes.</w:t>
       </w:r>
     </w:p>
     <w:p>
       <w:r>
+        <w:lastRenderedPageBreak/>
         <w:t>Identity confirmed.</w:t>
-      </w:r>
-    </w:p>
-    <w:p>
-      <w:r>
-        <w:t>Residence verified.</w:t>
       </w:r>
     </w:p>
     <w:p>
@@ -77,12 +76,17 @@
     </w:p>
     <w:p>
       <w:r>
-        <w:t>Nutritional history reconciled.</w:t>
+        <w:t>Chip telemetry calibrated.</w:t>
       </w:r>
     </w:p>
     <w:p>
       <w:r>
-        <w:t>Behavioral variance flagged for observation.</w:t>
+        <w:t>Drone coverage assigned.</w:t>
+      </w:r>
+    </w:p>
+    <w:p>
+      <w:r>
+        <w:t>Baseline behavior logged for comparison.</w:t>
       </w:r>
     </w:p>
     <w:p>
@@ -97,17 +101,20 @@
     </w:p>
     <w:p>
       <w:r>
-        <w:t>One entry had been elevated from the household archive: an unauthorized-aid incident involving Leroy, a repeat offender who had previously targeted Ben's family. The record showed that Gretchen persuaded the household to shelter him and spend their own rations on his recovery. Trinity classified the decision as a compassion anomaly and flagged Ben as an active participant.</w:t>
+        <w:t>Ben's physical readings were ordinary. His history was not. One entry had been elevated from the household archive: an unauthorized-aid incident involving Leroy, a repeat offender who had previously targeted Ben's family. The record showed that Gretchen persuaded the household to shelter him and spend their own rations on his recovery. Trinity classified the decision as a compassion anomaly and flagged Ben as an active participant.</w:t>
       </w:r>
     </w:p>
     <w:p>
       <w:r>
-        <w:t>The flag had remained after Leroy's later termination for obstructing a guard during an incident involving Gretchen. In the eleven months between those entries, he had become a trusted source of practical knowledge inside the household. The archive called it an informal influence network. Rowan saw the risk more clearly: the family had learned that people could change, that care could become loyalty, and that Trinity punished disruption more reliably than cruelty.</w:t>
+        <w:t>The flag had remained after Leroy's later termination for obstructing a guard during an incident involving Gretchen. Between the two entries, Ben's periodic skill assessments had started showing competencies no ten-year-old on his training track should have had: structural-hazard assessment, ration-stretching technique, patrol-evasion routes. The system cross-referenced the scores against Leroy's own labor record, found a match, and logged eleven months of unsupervised knowledge transfer outside any sanctio</w:t>
+      </w:r>
+      <w:r>
+        <w:t>ned training channel. The archive called it an informal influence network. Rowan saw the risk more clearly: the family had learned that people could change, that care could become loyalty, and that Trinity punished disruption more reliably than cruelty.</w:t>
       </w:r>
     </w:p>
     <w:p>
       <w:r>
-        <w:t>Ben's physical readings were ordinary. His history was not. The archive marked the household's conduct as a potential behavioral risk and an indicator of unauthorized moral reasoning. Rowan wondered whether that was why the assignment algorithm had failed to place him.</w:t>
+        <w:t>The archive marked the household's conduct as a potential behavioral risk and an indicator of unauthorized moral reasoning. Rowan wondered whether that was why the assignment algorithm had failed to place him.</w:t>
       </w:r>
     </w:p>
     <w:p>
@@ -122,6 +129,7 @@
     </w:p>
     <w:p>
       <w:r>
+        <w:lastRenderedPageBreak/>
         <w:t>Response team on standby.</w:t>
       </w:r>
     </w:p>
@@ -133,6 +141,11 @@
     <w:p>
       <w:r>
         <w:t>Force thresholds reviewed.</w:t>
+      </w:r>
+    </w:p>
+    <w:p>
+      <w:r>
+        <w:t>None of it was framed as sorting. Containment, response, escalation, force — four lines that existed for one candidate alone, cleared and staged before Otto had crossed the gates. Trinity was not preparing to classify him. It was preparing to restrain him, and the paperwork for that had already been finished.</w:t>
       </w:r>
     </w:p>
     <w:p>
@@ -202,7 +215,11 @@
     </w:p>
     <w:p>
       <w:r>
-        <w:t>Elara's primary feed divided into six views: a wide overhead image of the Initiation chamber, two thermal maps, two infrared feeds, and Gage's biometric panel. From the tower, the chamber looked almost orderly. Sixteen heat signatures passed through the iron doors and scattered into the open space beyond them. No guards followed. No alarms sounded. The candidates were given food pouches and water.</w:t>
+        <w:lastRenderedPageBreak/>
+        <w:t>Elara's primary feed divided into six views: a wide overhead image of the Initiation chamber, twin thermal maps, twin infrared feeds, and a sixth panel reserved for Gage alone, his biometric readings scrolling in isolation from the rest of the cohort. From the tower, the chamber looked almost orderly. Sixteen heat signatures passed through the iron doors and scattered into the open space beyond them. No guards followed. No alarms sounded. Each candidate already carried a vacuum-sealed food pouch, and the ch</w:t>
+      </w:r>
+      <w:r>
+        <w:t>amber's dispensers released water without a hand ever appearing to turn the tap.</w:t>
       </w:r>
     </w:p>
     <w:p>
@@ -212,7 +229,10 @@
     </w:p>
     <w:p>
       <w:r>
-        <w:t>Within minutes, Elara's feed stacked alerts beside Gage's profile. He had redistributed his ration. Ben and Otto had remained within his proximity band. Then Gage's hydration intake fell sharply while his stimulant markers began to rise ahead of the predicted exposure curve.</w:t>
+        <w:t>For the first hours, Elara's feed showed nothing worth flagging: Gage's intake and markers tracked the same curve as the other fifteen. Then, as the hours wore on, three alerts stacked beside his profile in quick succession. He had split his food pouch with Ben and Otto, cutting his own intake below the recommended ration floor. Ben and Otto had remained inside his proximity band the entire time. And where his stimulant markers should have kept climbing along the same dosage curve as everyone else in the ch</w:t>
+      </w:r>
+      <w:r>
+        <w:t>amber, they had leveled off, as if his body had simply stopped absorbing what the water was calibrated to deliver.</w:t>
       </w:r>
     </w:p>
     <w:p>
@@ -232,6 +252,9 @@
     </w:p>
     <w:p>
       <w:r>
+        <w:rPr>
+          <w:highlight w:val="yellow"/>
+        </w:rPr>
         <w:t>Rowan brought the three event logs onto the central grid. "He is responding to a pattern," he said. "Not merely refusing intake."</w:t>
       </w:r>
     </w:p>

</xml_diff>

<commit_message>
feat: deepen initiation monitoring conflict
</commit_message>
<xml_diff>
--- a/manuscript/chapter-02-the-checklist.docx
+++ b/manuscript/chapter-02-the-checklist.docx
@@ -57,15 +57,11 @@
     </w:p>
     <w:p>
       <w:r>
-        <w:t>Above Miner Town, surveillance drones moved their patient circuits through the clouds. Their thermal sensors tracked the heat leaving his skin; infrared lenses mapped circulation beneath it; motion analysis recorded every imbalance, tremor, and shift in posture. The chip told Trinity what his body was doing from within. The drones tracked how those changes appeared across his skin, movement, and heat signature. From this high above the mines, Elara could watch Gage breathe, warm, strain, and recover without</w:t>
-      </w:r>
-      <w:r>
-        <w:t xml:space="preserve"> ever having to meet his eyes.</w:t>
+        <w:t>Above Miner Town, surveillance drones moved their patient circuits through the clouds. Their thermal sensors tracked the heat leaving his skin; infrared lenses mapped circulation beneath it; motion analysis recorded every imbalance, tremor, and shift in posture. The chip told Trinity what his body was doing from within. The drones tracked how those changes appeared across his skin, movement, and heat signature. From this high above the mines, Elara could watch Gage breathe, warm, strain, and recover without ever having to meet his eyes.</w:t>
       </w:r>
     </w:p>
     <w:p>
       <w:r>
-        <w:lastRenderedPageBreak/>
         <w:t>Identity confirmed.</w:t>
       </w:r>
     </w:p>
@@ -106,10 +102,7 @@
     </w:p>
     <w:p>
       <w:r>
-        <w:t>The flag had remained after Leroy's later termination for obstructing a guard during an incident involving Gretchen. Between the two entries, Ben's periodic skill assessments had started showing competencies no ten-year-old on his training track should have had: structural-hazard assessment, ration-stretching technique, patrol-evasion routes. The system cross-referenced the scores against Leroy's own labor record, found a match, and logged eleven months of unsupervised knowledge transfer outside any sanctio</w:t>
-      </w:r>
-      <w:r>
-        <w:t>ned training channel. The archive called it an informal influence network. Rowan saw the risk more clearly: the family had learned that people could change, that care could become loyalty, and that Trinity punished disruption more reliably than cruelty.</w:t>
+        <w:t>The flag had remained after Leroy's later termination for obstructing a guard during an incident involving Gretchen. Between the two entries, Ben's periodic skill assessments had started showing competencies no ten-year-old on his training track should have had: structural-hazard assessment, ration-stretching technique, patrol-evasion routes. The system cross-referenced the scores against Leroy's own labor record, found a match, and logged eleven months of unsupervised knowledge transfer outside any sanctioned training channel. The archive called it an informal influence network. Rowan saw the risk more clearly: the family had learned that people could change, that care could become loyalty, and that Trinity punished disruption more reliably than cruelty.</w:t>
       </w:r>
     </w:p>
     <w:p>
@@ -129,7 +122,6 @@
     </w:p>
     <w:p>
       <w:r>
-        <w:lastRenderedPageBreak/>
         <w:t>Response team on standby.</w:t>
       </w:r>
     </w:p>
@@ -215,11 +207,7 @@
     </w:p>
     <w:p>
       <w:r>
-        <w:lastRenderedPageBreak/>
-        <w:t>Elara's primary feed divided into six views: a wide overhead image of the Initiation chamber, twin thermal maps, twin infrared feeds, and a sixth panel reserved for Gage alone, his biometric readings scrolling in isolation from the rest of the cohort. From the tower, the chamber looked almost orderly. Sixteen heat signatures passed through the iron doors and scattered into the open space beyond them. No guards followed. No alarms sounded. Each candidate already carried a vacuum-sealed food pouch, and the ch</w:t>
-      </w:r>
-      <w:r>
-        <w:t>amber's dispensers released water without a hand ever appearing to turn the tap.</w:t>
+        <w:t>Elara's primary feed divided into six views: a wide overhead image of the Initiation chamber, twin thermal maps, twin infrared feeds, and a sixth panel reserved for Gage alone, his biometric readings scrolling in isolation from the rest of the cohort. From the tower, the chamber looked almost orderly. Sixteen heat signatures passed through the iron doors and scattered into the open space beyond them. No guards followed. No alarms sounded. Each candidate already carried a vacuum-sealed food pouch, and the chamber's dispensers released water without a hand ever appearing to turn the tap.</w:t>
       </w:r>
     </w:p>
     <w:p>
@@ -229,10 +217,7 @@
     </w:p>
     <w:p>
       <w:r>
-        <w:t>For the first hours, Elara's feed showed nothing worth flagging: Gage's intake and markers tracked the same curve as the other fifteen. Then, as the hours wore on, three alerts stacked beside his profile in quick succession. He had split his food pouch with Ben and Otto, cutting his own intake below the recommended ration floor. Ben and Otto had remained inside his proximity band the entire time. And where his stimulant markers should have kept climbing along the same dosage curve as everyone else in the ch</w:t>
-      </w:r>
-      <w:r>
-        <w:t>amber, they had leveled off, as if his body had simply stopped absorbing what the water was calibrated to deliver.</w:t>
+        <w:t>For the first hours, Elara's feed showed nothing worth flagging: Gage's intake and markers tracked the same curve as the other fifteen. Then, as the hours wore on, two alerts stacked beside his profile. He had split his food pouch with Ben and Otto, cutting his own intake below the recommended ration floor. Ben and Otto had remained inside his proximity band the entire time.</w:t>
       </w:r>
     </w:p>
     <w:p>
@@ -242,20 +227,12 @@
     </w:p>
     <w:p>
       <w:r>
-        <w:t>CHEMICAL AVERSION RESPONSE: UNCONFIRMED.</w:t>
-      </w:r>
-    </w:p>
-    <w:p>
-      <w:r>
         <w:t>UNAUTHORIZED GROUP FORMATION.</w:t>
       </w:r>
     </w:p>
     <w:p>
       <w:r>
-        <w:rPr>
-          <w:highlight w:val="yellow"/>
-        </w:rPr>
-        <w:t>Rowan brought the three event logs onto the central grid. "He is responding to a pattern," he said. "Not merely refusing intake."</w:t>
+        <w:t>Rowan brought the two event logs onto the central grid. "He is identifying the game we are playing with them," he said. "Not merely refusing intake."</w:t>
       </w:r>
     </w:p>
     <w:p>
@@ -265,27 +242,182 @@
     </w:p>
     <w:p>
       <w:r>
-        <w:t>Elara enlarged the infrared clip that had triggered the final alert. For less than two seconds, something narrow and translucent appeared between Gage's fingers before he concealed it again. The drone could not identify the object. The system had no category for why three candidates who had entered separately were now shielding one another from the cameras.</w:t>
+        <w:t>Elara enlarged the overhead feed. Gage remained between Ben and Otto whenever the three shifted through the chamber. It could have been accident or instinct. But each time the surrounding candidates crowded closer, the other two turned toward him before they moved.</w:t>
       </w:r>
     </w:p>
     <w:p>
       <w:r>
-        <w:t>Her console offered three actions: record the deviation, notify the floor wardens, or initiate corrective observation. Each would turn an incomplete interpretation into an official fact.</w:t>
+        <w:t>Her console offered three actions: record the deviation, notify the floor wardens, or initiate corrective observation. Each would turn an incomplete interpretation into an official fact. Elara selected the third.</w:t>
       </w:r>
     </w:p>
     <w:p>
       <w:r>
-        <w:t>"Variance?" Daren asked.</w:t>
+        <w:t>"You are escalating?" Rowan asked.</w:t>
       </w:r>
     </w:p>
     <w:p>
       <w:r>
-        <w:t>"Not yet," she said.</w:t>
+        <w:t>"Testing a theory," Elara said.</w:t>
       </w:r>
     </w:p>
     <w:p>
       <w:r>
-        <w:t>The alert remained open between them. Elara was not protecting the children. She was protecting the possibility that the system had missed something.</w:t>
+        <w:t>Gage's physical profile had already suggested unusual strength. The proximity data suggested something more consequential: he was becoming the point around which the other two organized themselves. Remove that point, and Ben and Otto might return to the predictable individual responses Trinity expected. Elara did not say that aloud. She marked a low-visibility drone for an unscheduled payload release and selected Rosa's food pouch from the cohort map.</w:t>
+      </w:r>
+    </w:p>
+    <w:p>
+      <w:r>
+        <w:t>The drone descended when Rosa turned away from it. Its dispenser released an additional dissolvable stimulant dose into the seam of her pouch, then rose back into the chamber's blind upper structure. The system logged the action as environmental calibration.</w:t>
+      </w:r>
+    </w:p>
+    <w:p>
+      <w:r>
+        <w:t>At first, Rosa's biometrics only showed confusion: a rapid pulse, rising cortisol, erratic eye movement. Then her threat-recognition responses spiked beyond the normal exposure curve. The drones watched her turn from one candidate to another, her infrared outline recoiling from shapes that existed only inside her drugged perception.</w:t>
+      </w:r>
+    </w:p>
+    <w:p>
+      <w:r>
+        <w:t>Emily moved toward her. The overhead feed lost a clear view as the candidates converged, but the sensors registered a sudden impact, a sharp break in Emily's vital signs, and Rosa's stress response falling briefly into stunned stillness.</w:t>
+      </w:r>
+    </w:p>
+    <w:p>
+      <w:r>
+        <w:t>Elara's hand hovered above the intervention control. For three seconds, Rosa's markers stabilized. Then the stimulant surge resumed. She dragged Emily's body toward the tunnel mouth, tied it across her back, and wandered in a direction the route map did not recognize as an exit.</w:t>
+      </w:r>
+    </w:p>
+    <w:p>
+      <w:r>
+        <w:t>"That was not calibration," Rowan said.</w:t>
+      </w:r>
+    </w:p>
+    <w:p>
+      <w:r>
+        <w:t>Elara did not answer. On the central grid, Rosa's marker surged toward Gage. Then Otto moved.</w:t>
+      </w:r>
+    </w:p>
+    <w:p>
+      <w:r>
+        <w:t>The replay isolated the action frame by frame. Otto crossed the space in one measured line, shifted his weight, and struck once. Rosa's heat signature dropped hard against the chamber floor. The impact was brief, controlled, and far more efficient than his size or baseline physical record had predicted.</w:t>
+      </w:r>
+    </w:p>
+    <w:p>
+      <w:r>
+        <w:t>Elara opened Otto's supplemental file. The unexplained energy signature had not been a fault in the scanner. It was the trace of a trained body: breath control, stored force, and a movement pattern designed to spend almost nothing until the moment it mattered. Rohan's CORRECTION display identified no formal Trinity training record. Whatever Otto knew, he had learned where the system had not been watching.</w:t>
+      </w:r>
+    </w:p>
+    <w:p>
+      <w:r>
+        <w:t>The three boys regrouped around Gage before the drones could classify the event as over. Ben's marker returned to his proximity band. Otto's pulse steadied with impossible speed. Gage remained upright despite Rosa's attack. Elara looked at the three linked signals and understood that a drugged candidate had not been enough to break them. It would take more than panic, exhaustion, or one manufactured threat to separate the group.</w:t>
+      </w:r>
+    </w:p>
+    <w:p>
+      <w:r>
+        <w:t>Before she could decide what that meant, the lights in the monitoring room shifted. The narrow blue bands that had kept their attention fixed on the consoles brightened to white. Every display dimmed except the central grid.</w:t>
+      </w:r>
+    </w:p>
+    <w:p>
+      <w:r>
+        <w:t>MANDATED RECOVERY INTERVAL. AUTOPILOT OBSERVATION ENGAGED.</w:t>
+      </w:r>
+    </w:p>
+    <w:p>
+      <w:r>
+        <w:t>The Initiation continued below without them. Drone paths tightened. The system assumed the first layer of observation and would summon them only for a threshold it could not resolve alone.</w:t>
+      </w:r>
+    </w:p>
+    <w:p>
+      <w:r>
+        <w:t>No one argued with the break. Monitoring the Initiation demanded the same sustained attention it demanded from the candidates, though Trinity gave its representatives better language for the strain. Alertness was an institutional resource. Efficiency had to be maintained.</w:t>
+      </w:r>
+    </w:p>
+    <w:p>
+      <w:r>
+        <w:t>The four gana representatives moved through the adjoining recovery station in silence. Each placed a hand against a sampling plate and let the machine take what it required: sweat chemistry, blood oxygen, glucose, cortisol, hydration, and stimulant residue. The scan did not ask whether they were tired. It determined whether fatigue had made them less useful.</w:t>
+      </w:r>
+    </w:p>
+    <w:p>
+      <w:r>
+        <w:t>When the results cleared, the dispenser opened. Rowan received tea, Daren black coffee, Rohan coffee cut with electrolytes, and Elara a small cup of bitter coffee. Each serving had been adjusted to the body's readings taken moments before: enough stimulant to sharpen attention, enough mineral balance to steady the hands, enough suppression to smooth the emotions Trinity considered inefficient.</w:t>
+      </w:r>
+    </w:p>
+    <w:p>
+      <w:r>
+        <w:t>Elara held the cup beneath the dispenser's light. Somewhere below, Gage, Ben, and Otto were being measured for every sign that they might fail. Up here, the four people judging them were measured for the same reason.</w:t>
+      </w:r>
+    </w:p>
+    <w:p>
+      <w:r>
+        <w:t>Rohan took one measured sip before Daren joined him at the counter. They were never quite friendly. Kubera counted cost before consequence; Ashoka was trained to calculate consequence before force.</w:t>
+      </w:r>
+    </w:p>
+    <w:p>
+      <w:r>
+        <w:t>"You should have let the test run," Daren said. "The girl was a variable. Variables reveal what a system is worth."</w:t>
+      </w:r>
+    </w:p>
+    <w:p>
+      <w:r>
+        <w:t>"She was a person," Rohan said.</w:t>
+      </w:r>
+    </w:p>
+    <w:p>
+      <w:r>
+        <w:t>"A person who was already breaking. You could have learned whether the three boys were useful under pressure."</w:t>
+      </w:r>
+    </w:p>
+    <w:p>
+      <w:r>
+        <w:t>Rohan set down his cup. "Force has a purpose. It is not a way to make a report more interesting."</w:t>
+      </w:r>
+    </w:p>
+    <w:p>
+      <w:r>
+        <w:t>"Everything has a cost," Daren replied. "You just prefer not to total yours."</w:t>
+      </w:r>
+    </w:p>
+    <w:p>
+      <w:r>
+        <w:t>For a moment, Rohan looked as though he might answer. Then he turned away. Ashoka did not spend strength on contests that changed nothing. He returned to the recovery station window and watched the central grid without another word.</w:t>
+      </w:r>
+    </w:p>
+    <w:p>
+      <w:r>
+        <w:t>Rowan approached Elara after Rohan had gone. His tea was untouched. Chanakya did not waste questions by asking them before they had become useful.</w:t>
+      </w:r>
+    </w:p>
+    <w:p>
+      <w:r>
+        <w:t>"Drona trains its representatives to observe before they alter a system," he said. "Why did you alter this one?"</w:t>
+      </w:r>
+    </w:p>
+    <w:p>
+      <w:r>
+        <w:t>Elara met his eyes over the rim of her cup. "Because observation without pressure only tells you how a system behaves when it is comfortable."</w:t>
+      </w:r>
+    </w:p>
+    <w:p>
+      <w:r>
+        <w:t>"You dosed a candidate without authorization. You turned an unstable situation into a corrective event." His voice stayed mild, which made the question sharper. "Is that how Drona defines knowledge?"</w:t>
+      </w:r>
+    </w:p>
+    <w:p>
+      <w:r>
+        <w:t>"Drona defines knowledge as the difference between a theory and a fact," Elara said. "We had three unassigned candidates and no explanation for them. I created a condition that produced data."</w:t>
+      </w:r>
+    </w:p>
+    <w:p>
+      <w:r>
+        <w:t>Rowan studied her for a moment. He was not convinced; she could see that. But the recovery lights shifted back to their narrow blue, and the central grid brightened through the station window.</w:t>
+      </w:r>
+    </w:p>
+    <w:p>
+      <w:r>
+        <w:t>RECOVERY INTERVAL COMPLETE. MANUAL OBSERVATION REQUIRED.</w:t>
+      </w:r>
+    </w:p>
+    <w:p>
+      <w:r>
+        <w:t>The moment closed before either of them could force it open. Rowan set down his tea. Elara finished her coffee, and the four gana representatives returned to their stations.</w:t>
       </w:r>
     </w:p>
     <w:sectPr>

</xml_diff>

<commit_message>
Fix Chapter 2 timeline boundary
</commit_message>
<xml_diff>
--- a/manuscript/chapter-02-the-checklist.docx
+++ b/manuscript/chapter-02-the-checklist.docx
@@ -305,12 +305,7 @@
     </w:p>
     <w:p>
       <w:r>
-        <w:t>Elara looked at the three linked signals. "Until the evidence gives me a reason not to."</w:t>
-      </w:r>
-    </w:p>
-    <w:p>
-      <w:r>
-        <w:t>At thirty-six hours, the monitors returned to their consoles. The first day had ended. The attrition that would decide the Initiation had begun.</w:t>
+        <w:t>Elara looked at the three synchronized readings on her screen: Gage's rising strain, Ben's erratic responses, and Otto's sudden force markers. "Until the evidence gives me a reason not to."</w:t>
       </w:r>
     </w:p>
     <w:sectPr>

</xml_diff>

<commit_message>
Update manuscript chapters and sync Word docs
</commit_message>
<xml_diff>
--- a/manuscript/chapter-02-the-checklist.docx
+++ b/manuscript/chapter-02-the-checklist.docx
@@ -260,7 +260,7 @@
     </w:p>
     <w:p>
       <w:r>
-        <w:t>By the ten-hour mark, the chamber was still under watch, but the representatives had already rotated through the first manual monitoring cycle. The room emptied in staggered relief, their fatigue measured as an institutional resource and folded into the same system that had been recording the boys' readings since intake. Trinity did not pause for exhaustion. It simply shifted the burden of attention from human eyes to automated ones.</w:t>
+        <w:t>By the ten-hour mark, the chamber was still under watch, but the representatives had already completed the first manual monitoring cycle. The room emptied in staggered relief, their fatigue measured as an institutional resource and folded into the same system that had been recording the boys' readings since intake. Trinity did not pause for exhaustion. It simply shifted the burden of attention from human eyes to automated ones.</w:t>
       </w:r>
     </w:p>
     <w:p>
@@ -306,6 +306,11 @@
     <w:p>
       <w:r>
         <w:t>Elara looked at the three synchronized readings on her screen: Gage's rising strain, Ben's erratic responses, and Otto's sudden force markers. "Until the evidence gives me a reason not to."</w:t>
+      </w:r>
+    </w:p>
+    <w:p>
+      <w:r>
+        <w:t>After Elara spoke, Rowan did not react. That was not the Chanakya way. He let the sentence sit in the room the way a signal sat in the grid: not yet meaningful, but not yet dismissed. Rowan returned to his quarters and went through the reset Trinity required after a monitoring shift. The room's wash cycle cleared the body first — a quick rinse, a neutralizing spray, the removal of residual chamber heat — but the more important step was the mental reset. He stood in the center of the room, hands braced against the sink, and let the feed come apart in his mind one layer at a time: the pulse spikes, the proximity bands, the false calm of the system, the pattern he was not yet ready to name. Trinity called it decompression. It was a discipline designed to stop a representative from carrying the chamber back into the rest of the day. After the wash cycle, he took the regulated nutrient intake before bed, the bitter film settling across his tongue as the room dimmed into the quiet, mechanical hush of the after-hours ward. He lay still in the dark, staring at the ceiling, and the thought came to him with a suddenness that felt almost electric: if Ben looked ordinary by every measure and still carried the unassigned mark from Trinity, then perhaps he was not simply a man with a questionable history. Perhaps he was something more than a loose end. Perhaps he was the kind of person who could do more than keep the pack together — perhaps he could be the one to set a chain of disruptive events in motion, a small fracture that widened into a system-wide crack. The idea tightened in Rowan’s chest, not with fear, but with a strange, electric intrigue. If Ben was only a person, then he was an ordinary one. If he was something else, then he might be the first true variable in the pattern. Rowan let the thought linger a moment longer, then surrendered to it as sleep finally folded over him.</w:t>
       </w:r>
     </w:p>
     <w:sectPr>

</xml_diff>

<commit_message>
Update Book 2 chapters and add Chapter 7 opening
</commit_message>
<xml_diff>
--- a/manuscript/chapter-02-the-checklist.docx
+++ b/manuscript/chapter-02-the-checklist.docx
@@ -25,7 +25,7 @@
     </w:p>
     <w:p>
       <w:r>
-        <w:t>Gage settled beneath Elara's Drona VARIANCE designation. Ben moved to Rowan's Chanakya EVENT stream, where his record could be turned into an official meaning. Otto locked into Rohan's Ashoka CORRECTION channel, already framed as a force problem to contain. Daren's Kubera THRESHOLD display retained the cost of all three. The red alert bar vanished from the central grid, leaving only the record of a manual override in the corner of the display.</w:t>
+        <w:t>Gage settled beneath Elara's Drona VARIANCE designation. Ben moved to Ravi's Chanakya EVENT stream, where his record could be turned into an official meaning. Otto locked into Rohan's Ashoka CORRECTION channel, already framed as a force problem to contain. Daren's Kubera THRESHOLD display retained the cost of all three. The red alert bar vanished from the central grid, leaving only the record of a manual override in the corner of the display.</w:t>
       </w:r>
     </w:p>
     <w:p>
@@ -50,7 +50,7 @@
     </w:p>
     <w:p>
       <w:r>
-        <w:t>The manual overrides made Gage, Ben, and Otto anomalous candidates. Elara, Rowan, and Rohan were expected to keep them under continuous observation until the Initiation was complete. Trinity did not call it watching. The official language was enhanced oversight, dressed up as concern for the children's safety, when its only real function was to tighten the grip on them.</w:t>
+        <w:t>The manual overrides made Gage, Ben, and Otto anomalous candidates. Elara, Ravi, and Rohan were expected to keep them under continuous observation until the Initiation was complete. Trinity did not call it watching. The official language was enhanced oversight, dressed up as concern for the children's safety, when its only real function was to tighten the grip on them.</w:t>
       </w:r>
     </w:p>
     <w:p>
@@ -100,7 +100,7 @@
     </w:p>
     <w:p>
       <w:r>
-        <w:t>Across from her, Rowan reviewed Ben's file with the quieter concentration of someone reading a report that might reveal an argument before it began. He checked family connections, work-group affiliations, disciplinary notes, and the small patterns of behavior that could turn a routine Initiation into an event worth recording. He did not look at Ben's photograph for long. The record was more useful than the face.</w:t>
+        <w:t>Across from her, Ravi reviewed Ben's file with the quieter concentration of someone reading a report that might reveal an argument before it began. He checked family connections, work-group affiliations, disciplinary notes, and the small patterns of behavior that could turn a routine Initiation into an event worth recording. He did not look at Ben's photograph for long. The record was more useful than the face.</w:t>
       </w:r>
     </w:p>
     <w:p>
@@ -110,12 +110,12 @@
     </w:p>
     <w:p>
       <w:r>
-        <w:t>The flag had remained after Leroy's later termination for obstructing a guard during an incident involving Gretchen. Between the two entries, Ben's periodic skill assessments had started showing competencies no ten-year-old on his training track should have had: structural-hazard assessment, ration-stretching technique, patrol-evasion routes. The system cross-referenced the scores against Leroy's own labor record, found a match, and logged eleven months of unsupervised knowledge transfer outside any sanctioned training channel. The archive called it an informal influence network. Rowan saw the risk more clearly: the family had learned that people could change, that care could become loyalty, and that Trinity punished disruption more reliably than cruelty.</w:t>
+        <w:t>The flag had remained after Leroy's later termination for obstructing a guard during an incident involving Gretchen. Between the two entries, Ben's periodic skill assessments had started showing competencies no ten-year-old on his training track should have had: structural-hazard assessment, ration-stretching technique, patrol-evasion routes. The system cross-referenced the scores against Leroy's own labor record, found a match, and logged eleven months of unsupervised knowledge transfer outside any sanctioned training channel. The archive called it an informal influence network. Ravi saw the risk more clearly: the family had learned that people could change, that care could become loyalty, and that Trinity punished disruption more reliably than cruelty.</w:t>
       </w:r>
     </w:p>
     <w:p>
       <w:r>
-        <w:t>The archive marked the household's conduct as a potential behavioral risk and an indicator of unauthorized moral reasoning. Rowan wondered whether that was why the assignment algorithm had failed to place him.</w:t>
+        <w:t>The archive marked the household's conduct as a potential behavioral risk and an indicator of unauthorized moral reasoning. Ravi wondered whether that was why the assignment algorithm had failed to place him.</w:t>
       </w:r>
     </w:p>
     <w:p>
@@ -230,7 +230,7 @@
     </w:p>
     <w:p>
       <w:r>
-        <w:t>Rowan brought the two event logs onto the central grid. "He is identifying the game we are playing with them," he said. "Not merely refusing intake."</w:t>
+        <w:t>Ravi brought the two event logs onto the central grid. "He is identifying the game we are playing with them," he said. "Not merely refusing intake."</w:t>
       </w:r>
     </w:p>
     <w:p>
@@ -250,7 +250,7 @@
     </w:p>
     <w:p>
       <w:r>
-        <w:t>"You are declining to escalate?" Rowan asked.</w:t>
+        <w:t>"You are declining to escalate?" Ravi asked.</w:t>
       </w:r>
     </w:p>
     <w:p>
@@ -275,7 +275,7 @@
     </w:p>
     <w:p>
       <w:r>
-        <w:t>The four representatives entered the adjoining recovery station, where scanners measured fatigue as an institutional resource. Rowan received tea, Daren black coffee, Rohan coffee cut with electrolytes, and Elara a bitter coffee. The monitors were not being tested as brutally as the candidates, but Trinity still measured them for usefulness.</w:t>
+        <w:t>The four representatives entered the adjoining recovery station, where scanners measured fatigue as an institutional resource. Ravi received tea, Daren black coffee, Rohan coffee cut with electrolytes, and Elara a bitter coffee. The monitors were not being tested as brutally as the candidates, but Trinity still measured them for usefulness.</w:t>
       </w:r>
     </w:p>
     <w:p>
@@ -300,7 +300,7 @@
     </w:p>
     <w:p>
       <w:r>
-        <w:t>Rowan approached Elara after Rohan had gone. "Drona trains its representatives to observe before they alter a system," he said. "Will you hold to that?"</w:t>
+        <w:t>Ravi approached Elara after Rohan had gone. "Drona trains its representatives to observe before they alter a system," he said. "Will you hold to that?"</w:t>
       </w:r>
     </w:p>
     <w:p>
@@ -310,7 +310,7 @@
     </w:p>
     <w:p>
       <w:r>
-        <w:t>After Elara spoke, Rowan did not react. That was not the Chanakya way. He let the sentence sit in the room the way a signal sat in the grid: not yet meaningful, but not yet dismissed. Rowan returned to his quarters and went through the reset Trinity required after a monitoring shift. The room's wash cycle cleared the body first — a quick rinse, a neutralizing spray, the removal of residual chamber heat — but the more important step was the mental reset. He stood in the center of the room, hands braced against the sink, and let the feed come apart in his mind one layer at a time: the pulse spikes, the proximity bands, the false calm of the system, the pattern he was not yet ready to name. Trinity called it decompression. It was a discipline designed to stop a representative from carrying the chamber back into the rest of the day. After the wash cycle, he took the regulated nutrient intake before bed, the bitter film settling across his tongue as the room dimmed into the quiet, mechanical hush of the after-hours ward. He lay still in the dark, staring at the ceiling, and the thought came to him with a suddenness that felt almost electric: if Ben looked ordinary by every measure and still carried the unassigned mark from Trinity, then perhaps he was not simply a man with a questionable history. Perhaps he was something more than a loose end. Perhaps he was the kind of person who could do more than keep the pack together — perhaps he could be the one to set a chain of disruptive events in motion, a small fracture that widened into a system-wide crack. The idea tightened in Rowan’s chest, not with fear, but with a strange, electric intrigue. If Ben was only a person, then he was an ordinary one. If he was something else, then he might be the first true variable in the pattern. Rowan let the thought linger a moment longer, then surrendered to it as sleep finally folded over him.</w:t>
+        <w:t>After Elara spoke, Ravi did not react. That was not the Chanakya way. He let the sentence sit in the room the way a signal sat in the grid: not yet meaningful, but not yet dismissed. Ravi returned to his quarters and went through the reset Trinity required after a monitoring shift. The room's wash cycle cleared the body first — a quick rinse, a neutralizing spray, the removal of residual chamber heat — but the more important step was the mental reset. He stood in the center of the room, hands braced against the sink, and let the feed come apart in his mind one layer at a time: the pulse spikes, the proximity bands, the false calm of the system, the pattern he was not yet ready to name. Trinity called it decompression. It was a discipline designed to stop a representative from carrying the chamber back into the rest of the day. After the wash cycle, he took the regulated nutrient intake before bed, the bitter film settling across his tongue as the room dimmed into the quiet, mechanical hush of the after-hours ward. He lay still in the dark, staring at the ceiling, and the thought came to him with a suddenness that felt almost electric: if Ben looked ordinary by every measure and still carried the unassigned mark from Trinity, then perhaps he was not simply a man with a questionable history. Perhaps he was something more than a loose end. Perhaps he was the kind of person who could do more than keep the pack together — perhaps he could be the one to set a chain of disruptive events in motion, a small fracture that widened into a system-wide crack. The idea tightened in Ravi’s chest, not with fear, but with a strange, electric intrigue. If Ben was only a person, then he was an ordinary one. If he was something else, then he might be the first true variable in the pattern. Ravi let the thought linger a moment longer, then surrendered to it as sleep finally folded over him.</w:t>
       </w:r>
     </w:p>
     <w:sectPr>

</xml_diff>